<commit_message>
fix: publish launcher, compare filters, and guide updates
</commit_message>
<xml_diff>
--- a/docs/Yang-gumi配置说明.docx
+++ b/docs/Yang-gumi配置说明.docx
@@ -57,7 +57,7 @@
           <w:color w:val="606975"/>
           <w:sz w:val="21"/>
         </w:rPr>
-        <w:t>2026年7月更新版|Windows 10/11</w:t>
+        <w:t>2026年8月更新版 | Windows 10/11 | 当前版本 1.2.10</w:t>
       </w:r>
     </w:p>
     <w:p>
@@ -931,15 +931,15 @@
           <w:color w:val="222222"/>
           <w:sz w:val="19"/>
         </w:rPr>
-        <w:t>py-3.13--version</w:t>
-      </w:r>
-    </w:p>
-    <w:p>
-      <w:r>
-        <w:rPr>
-          <w:rFonts w:ascii="微软雅黑" w:hAnsi="微软雅黑" w:eastAsia="微软雅黑" w:cs="微软雅黑"/>
-        </w:rPr>
-        <w:t>正常情况会显示Python 3.13.x。若系统提示找不到py，可以再输入python--version。两个命令都找不到时，重新安装Python并确认已经勾选PATH选项。</w:t>
+        <w:t>py -3.13 --version</w:t>
+      </w:r>
+    </w:p>
+    <w:p>
+      <w:r>
+        <w:rPr>
+          <w:rFonts w:ascii="微软雅黑" w:hAnsi="微软雅黑" w:eastAsia="微软雅黑" w:cs="微软雅黑"/>
+        </w:rPr>
+        <w:t>正常情况会显示Python 3.13.x。若系统提示找不到py，可以再输入python --version。两个命令都找不到时，重新安装Python并确认已经勾选PATH选项。</w:t>
       </w:r>
     </w:p>
     <w:p>
@@ -1271,7 +1271,7 @@
                 <w:rFonts w:ascii="微软雅黑" w:hAnsi="微软雅黑" w:eastAsia="微软雅黑" w:cs="微软雅黑"/>
                 <w:sz w:val="19"/>
               </w:rPr>
-              <w:t>安装并启动Yang-gumi.bat</w:t>
+              <w:t>安装并启动 Yang-gumi.bat</w:t>
             </w:r>
           </w:p>
         </w:tc>
@@ -1339,7 +1339,7 @@
                 <w:rFonts w:ascii="微软雅黑" w:hAnsi="微软雅黑" w:eastAsia="微软雅黑" w:cs="微软雅黑"/>
                 <w:sz w:val="19"/>
               </w:rPr>
-              <w:t>启动Yang-gumi.bat</w:t>
+              <w:t>启动 Yang-gumi.bat</w:t>
             </w:r>
           </w:p>
         </w:tc>
@@ -1364,7 +1364,7 @@
                 <w:rFonts w:ascii="微软雅黑" w:hAnsi="微软雅黑" w:eastAsia="微软雅黑" w:cs="微软雅黑"/>
                 <w:sz w:val="19"/>
               </w:rPr>
-              <w:t>安装完成后的日常启动入口。</w:t>
+              <w:t>安装完成后的日常启动入口；会安全替换本目录旧实例，确保8501端口只保留一个主站。</w:t>
             </w:r>
           </w:p>
         </w:tc>
@@ -1432,7 +1432,7 @@
                 <w:rFonts w:ascii="微软雅黑" w:hAnsi="微软雅黑" w:eastAsia="微软雅黑" w:cs="微软雅黑"/>
                 <w:sz w:val="19"/>
               </w:rPr>
-              <w:t>主人在项目文件夹内运行时开启分享；复制到其他电脑后也可作为访客入口。</w:t>
+              <w:t>主人在项目文件夹内开启只读分享；主站无响应时可切换独立只读上游，并自动重连临时公网入口。</w:t>
             </w:r>
           </w:p>
         </w:tc>
@@ -1475,7 +1475,7 @@
                 <w:rFonts w:ascii="微软雅黑" w:hAnsi="微软雅黑" w:eastAsia="微软雅黑" w:cs="微软雅黑"/>
                 <w:sz w:val="19"/>
               </w:rPr>
-              <w:t>给访客打开Yang-gumi.bat</w:t>
+              <w:t>给访客打开 Yang-gumi.bat</w:t>
             </w:r>
           </w:p>
         </w:tc>
@@ -1543,7 +1543,7 @@
                 <w:rFonts w:ascii="微软雅黑" w:hAnsi="微软雅黑" w:eastAsia="微软雅黑" w:cs="微软雅黑"/>
                 <w:sz w:val="19"/>
               </w:rPr>
-              <w:t>检查并更新Yang-gumi.bat</w:t>
+              <w:t>检查并更新 Yang-gumi.bat</w:t>
             </w:r>
           </w:p>
         </w:tc>
@@ -1568,7 +1568,7 @@
                 <w:rFonts w:ascii="微软雅黑" w:hAnsi="微软雅黑" w:eastAsia="微软雅黑" w:cs="微软雅黑"/>
                 <w:sz w:val="19"/>
               </w:rPr>
-              <w:t>由使用者主动检查并安装程序更新。</w:t>
+              <w:t>由使用者主动检查并安装正式增量更新；只替换程序文件，成功后安全重启本目录正在运行的网站。</w:t>
             </w:r>
           </w:p>
         </w:tc>
@@ -1679,7 +1679,7 @@
                 <w:rFonts w:ascii="微软雅黑" w:hAnsi="微软雅黑" w:eastAsia="微软雅黑" w:cs="微软雅黑"/>
                 <w:sz w:val="19"/>
               </w:rPr>
-              <w:t>卸载Yang-gumi.bat</w:t>
+              <w:t>卸载 Yang-gumi.bat</w:t>
             </w:r>
           </w:p>
         </w:tc>
@@ -1772,7 +1772,7 @@
                 <w:rFonts w:ascii="微软雅黑" w:hAnsi="微软雅黑" w:eastAsia="微软雅黑" w:cs="微软雅黑"/>
                 <w:sz w:val="19"/>
               </w:rPr>
-              <w:t>保存评分数据库、评分设置和本机使用配置。</w:t>
+              <w:t>保存评分数据库、评分设置、本机路径、今日美图设置、图片索引和其他个人配置；更新不得覆盖。</w:t>
             </w:r>
           </w:p>
         </w:tc>
@@ -1961,7 +1961,7 @@
         <w:rPr>
           <w:rFonts w:ascii="微软雅黑" w:hAnsi="微软雅黑" w:eastAsia="微软雅黑" w:cs="微软雅黑"/>
         </w:rPr>
-        <w:t>双击“安装并启动Yang-gumi.bat”。</w:t>
+        <w:t>双击“安装并启动 Yang-gumi.bat”。</w:t>
       </w:r>
     </w:p>
     <w:p>
@@ -2028,15 +2028,15 @@
         <w:pStyle w:val="5"/>
       </w:pPr>
       <w:r>
-        <w:t>4.2如果文件夹中没有“安装并启动”文件</w:t>
-      </w:r>
-    </w:p>
-    <w:p>
-      <w:r>
-        <w:rPr>
-          <w:rFonts w:ascii="微软雅黑" w:hAnsi="微软雅黑" w:eastAsia="微软雅黑" w:cs="微软雅黑"/>
-        </w:rPr>
-        <w:t>某些已经整理过的固定工作区只保留“启动Yang-gumi.bat”。如果双击启动后提示缺少Streamlit或项目依赖，请在项目文件夹中安装requirements.txt里的内容。</w:t>
+        <w:t>4.2 如果文件夹中没有“安装并启动 Yang-gumi”文件</w:t>
+      </w:r>
+    </w:p>
+    <w:p>
+      <w:r>
+        <w:rPr>
+          <w:rFonts w:ascii="微软雅黑" w:hAnsi="微软雅黑" w:eastAsia="微软雅黑" w:cs="微软雅黑"/>
+        </w:rPr>
+        <w:t>某些已经整理过的固定工作区只保留“启动 Yang-gumi.bat”。如果双击启动后提示缺少Streamlit或项目依赖，请在项目文件夹中安装requirements.txt里的内容。</w:t>
       </w:r>
     </w:p>
     <w:p>
@@ -2088,7 +2088,7 @@
           <w:color w:val="222222"/>
           <w:sz w:val="19"/>
         </w:rPr>
-        <w:t>py-3.13-m pip install-r requirements.txt</w:t>
+        <w:t>py -3.13 -m pip install -r requirements.txt</w:t>
       </w:r>
     </w:p>
     <w:p>
@@ -2105,7 +2105,7 @@
         <w:rPr>
           <w:rFonts w:ascii="微软雅黑" w:hAnsi="微软雅黑" w:eastAsia="微软雅黑" w:cs="微软雅黑"/>
         </w:rPr>
-        <w:t>等待命令完成，再双击“启动Yang-gumi.bat”。</w:t>
+        <w:t>等待命令完成，再双击“启动 Yang-gumi.bat”。</w:t>
       </w:r>
     </w:p>
     <w:p>
@@ -2155,7 +2155,7 @@
         <w:rPr>
           <w:rFonts w:ascii="微软雅黑" w:hAnsi="微软雅黑" w:eastAsia="微软雅黑" w:cs="微软雅黑"/>
         </w:rPr>
-        <w:t>双击“启动Yang-gumi.bat”。</w:t>
+        <w:t>双击“启动 Yang-gumi.bat”。</w:t>
       </w:r>
     </w:p>
     <w:p>
@@ -2197,7 +2197,7 @@
         <w:rPr>
           <w:rFonts w:ascii="微软雅黑" w:hAnsi="微软雅黑" w:eastAsia="微软雅黑" w:cs="微软雅黑"/>
         </w:rPr>
-        <w:t>如果网站已经在运行，再次双击启动文件通常只会重新打开浏览器。不要同时保留多个重复的启动窗口，以免出现8501被占用的提示。</w:t>
+        <w:t>如果本目录的网站已经在运行，再次双击“启动 Yang-gumi.bat”会先核对8501端口，只结束本安装目录的旧实例，再启动一个新实例；同一时间只保留一个主站。若公网分享正在运行，启动器会先暂停分享，主站恢复后再尝试恢复分享。</w:t>
       </w:r>
     </w:p>
     <w:p>
@@ -2827,7 +2827,7 @@
         <w:rPr>
           <w:rFonts w:ascii="微软雅黑" w:hAnsi="微软雅黑" w:eastAsia="微软雅黑" w:cs="微软雅黑"/>
         </w:rPr>
-        <w:t>方式二：直接双击项目文件夹中的“启动只读分享.bat”。如果主站没有运行，分享程序会按需要打开本地主站。</w:t>
+        <w:t>方式二：直接双击项目文件夹中的“启动只读分享.bat”。如果主站没有运行，分享程序会按需要启动只读上游；若8501端口上的旧实例无响应，也会改用独立本地端口，不会误结束其他程序。</w:t>
       </w:r>
     </w:p>
     <w:p>
@@ -2914,7 +2914,7 @@
         <w:rPr>
           <w:rFonts w:ascii="微软雅黑" w:hAnsi="微软雅黑" w:eastAsia="微软雅黑" w:cs="微软雅黑"/>
         </w:rPr>
-        <w:t>Windows访客也可以只接收“给访客打开Yang-gumi.bat”。主人必须在分享开始后再复制这个文件，因为文件中会同步当前入口。</w:t>
+        <w:t>Windows访客也可以只接收“给访客打开 Yang-gumi.bat”。主人必须在分享开始后再复制这个文件，因为文件中会同步当前入口。</w:t>
       </w:r>
     </w:p>
     <w:p>
@@ -2928,7 +2928,7 @@
         <w:rPr>
           <w:rFonts w:ascii="微软雅黑" w:hAnsi="微软雅黑" w:eastAsia="微软雅黑" w:cs="微软雅黑"/>
         </w:rPr>
-        <w:t>“启动只读分享.bat”也是双用途文件：它在完整项目文件夹中用于主人启动分享，单独放在另一台Windows电脑时会作为访客入口。普通情况下优先发送名称更清楚的“给访客打开Yang-gumi.bat”。</w:t>
+        <w:t>“启动只读分享.bat”也是双用途文件：它在完整项目文件夹中用于主人启动分享，单独放在另一台Windows电脑时会作为访客入口。普通情况下优先发送名称更清楚的“给访客打开 Yang-gumi.bat”。</w:t>
       </w:r>
     </w:p>
     <w:p>
@@ -2976,15 +2976,15 @@
         <w:rPr>
           <w:rFonts w:ascii="微软雅黑" w:hAnsi="微软雅黑" w:eastAsia="微软雅黑" w:cs="微软雅黑"/>
         </w:rPr>
-        <w:t>分享站读取主站当前数据。主人保存作品、分项评分、标签或评分设置后，访客页面会自动获得更新。若访客正停留在旧画面，可刷新浏览器或稍等片刻。</w:t>
-      </w:r>
-    </w:p>
-    <w:p>
-      <w:r>
-        <w:rPr>
-          <w:rFonts w:ascii="微软雅黑" w:hAnsi="微软雅黑" w:eastAsia="微软雅黑" w:cs="微软雅黑"/>
-        </w:rPr>
-        <w:t>分享网址只在当前分享持续期间有效。主人停止分享、关闭分享窗口、电脑断网或临时线路重新建立后，原网址可能失效。遇到这种情况，主人重新开始分享，并发送最新网址或重新复制访客BAT。</w:t>
+        <w:t>分享站以只读方式读取主人当前数据。主人保存作品、分项评分、标签或评分设置后，访客刷新页面即可看到更新；本地只读上游失效时，分享程序会自动切换到可用端口并重建安全代理。</w:t>
+      </w:r>
+    </w:p>
+    <w:p>
+      <w:r>
+        <w:rPr>
+          <w:rFonts w:ascii="微软雅黑" w:hAnsi="微软雅黑" w:eastAsia="微软雅黑" w:cs="微软雅黑"/>
+        </w:rPr>
+        <w:t>公网临时线路连续健康检查失败时会被回收并重连；访客启动文件会通过稳定定位器取得当前入口。直接发送的完整HTTPS网址仍可能在重连或停止分享后失效，此时应发送最新网址。</w:t>
       </w:r>
     </w:p>
     <w:p>
@@ -3143,7 +3143,7 @@
         <w:pStyle w:val="5"/>
       </w:pPr>
       <w:r>
-        <w:t>8.2手动更新</w:t>
+        <w:t>8.2 手动增量更新</w:t>
       </w:r>
     </w:p>
     <w:p>
@@ -3160,7 +3160,7 @@
         <w:rPr>
           <w:rFonts w:ascii="微软雅黑" w:hAnsi="微软雅黑" w:eastAsia="微软雅黑" w:cs="微软雅黑"/>
         </w:rPr>
-        <w:t>双击“检查并更新Yang-gumi.bat”。</w:t>
+        <w:t>双击“检查并更新 Yang-gumi.bat”。</w:t>
       </w:r>
     </w:p>
     <w:p>
@@ -3177,7 +3177,7 @@
         <w:rPr>
           <w:rFonts w:ascii="微软雅黑" w:hAnsi="微软雅黑" w:eastAsia="微软雅黑" w:cs="微软雅黑"/>
         </w:rPr>
-        <w:t>程序会显示当前版本和是否存在新内容。</w:t>
+        <w:t>程序会读取GitHub正式VERSION并显示当前版本、目标版本和是否存在新内容；不会根据提交数量猜测版本。</w:t>
       </w:r>
     </w:p>
     <w:p>
@@ -3211,7 +3211,7 @@
         <w:rPr>
           <w:rFonts w:ascii="微软雅黑" w:hAnsi="微软雅黑" w:eastAsia="微软雅黑" w:cs="微软雅黑"/>
         </w:rPr>
-        <w:t>选择Y后等待完成。更新程序会保留data、backups和个人配置。</w:t>
+        <w:t>选择Y后只下载发生变化的程序文件。下载筛选后和实际写入前都会检查目标路径；数据库、评分与收藏、私人笔记、今日美图设置、图片索引、本地海报与背景、令牌、日志、备份和导出都不得进入更新计划。</w:t>
       </w:r>
     </w:p>
     <w:p>
@@ -3228,15 +3228,15 @@
         <w:rPr>
           <w:rFonts w:ascii="微软雅黑" w:hAnsi="微软雅黑" w:eastAsia="微软雅黑" w:cs="微软雅黑"/>
         </w:rPr>
-        <w:t>更新完成后重新启动Yang-gumi。</w:t>
-      </w:r>
-    </w:p>
-    <w:p>
-      <w:r>
-        <w:rPr>
-          <w:rFonts w:ascii="微软雅黑" w:hAnsi="微软雅黑" w:eastAsia="微软雅黑" w:cs="微软雅黑"/>
-        </w:rPr>
-        <w:t>每次更新前都会建立返回点。更新只应通过项目提供的更新文件或完整新版本进行，不要用旧ZIP随意覆盖正在使用的项目文件夹。</w:t>
+        <w:t>若本目录主站正在运行，更新完成后会安全重启该实例并让新代码立即生效，不额外打开浏览器；网站原本未运行时不会被意外启动。</w:t>
+      </w:r>
+    </w:p>
+    <w:p>
+      <w:r>
+        <w:rPr>
+          <w:rFonts w:ascii="微软雅黑" w:hAnsi="微软雅黑" w:eastAsia="微软雅黑" w:cs="微软雅黑"/>
+        </w:rPr>
+        <w:t>每次更新前都会建立程序返回点和人工应急数据库快照。暂存目录与安装目录位于不同磁盘时也会先复制到目标同盘再原子替换；发布版BAT采用Windows CMD安全编码与CRLF换行。不要用旧ZIP覆盖正在使用的项目文件夹。</w:t>
       </w:r>
     </w:p>
     <w:p>
@@ -3303,7 +3303,7 @@
         <w:rPr>
           <w:rFonts w:ascii="微软雅黑" w:hAnsi="微软雅黑" w:eastAsia="微软雅黑" w:cs="微软雅黑"/>
         </w:rPr>
-        <w:t>这个操作针对最近一次程序更新。它不能替代平时的数据库备份，因此个人评分仍应单独备份。</w:t>
+        <w:t>这个操作只恢复最近一次更新涉及的程序文件，不会把旧数据库覆盖到后来新增的评分或收藏上。它仍不能替代平时的数据库备份。</w:t>
       </w:r>
     </w:p>
     <w:p>
@@ -3345,7 +3345,7 @@
         <w:rPr>
           <w:rFonts w:ascii="微软雅黑" w:hAnsi="微软雅黑" w:eastAsia="微软雅黑" w:cs="微软雅黑"/>
         </w:rPr>
-        <w:t>双击“卸载Yang-gumi.bat”。</w:t>
+        <w:t>双击“卸载 Yang-gumi.bat”。</w:t>
       </w:r>
     </w:p>
     <w:p>
@@ -3454,7 +3454,7 @@
         <w:rPr>
           <w:rFonts w:ascii="微软雅黑" w:hAnsi="微软雅黑" w:eastAsia="微软雅黑" w:cs="微软雅黑"/>
         </w:rPr>
-        <w:t>确认Python已安装，并重新执行py-3.13--version。</w:t>
+        <w:t>确认Python已安装，并重新执行py -3.13 --version。</w:t>
       </w:r>
     </w:p>
     <w:p>
@@ -3471,7 +3471,7 @@
         <w:rPr>
           <w:rFonts w:ascii="微软雅黑" w:hAnsi="微软雅黑" w:eastAsia="微软雅黑" w:cs="微软雅黑"/>
         </w:rPr>
-        <w:t>第一次使用应运行“安装并启动Yang-gumi.bat”。</w:t>
+        <w:t>第一次使用应运行“安装并启动 Yang-gumi.bat”。</w:t>
       </w:r>
     </w:p>
     <w:p>
@@ -3504,7 +3504,7 @@
         <w:rPr>
           <w:rFonts w:ascii="微软雅黑" w:hAnsi="微软雅黑" w:eastAsia="微软雅黑" w:cs="微软雅黑"/>
         </w:rPr>
-        <w:t>重新运行“安装并启动Yang-gumi.bat”。如果项目中没有该文件，在项目文件夹终端执行下面的命令，然后再启动。</w:t>
+        <w:t>重新运行“安装并启动 Yang-gumi.bat”。如果项目中没有该文件，在项目文件夹终端执行下面的命令，然后再启动。</w:t>
       </w:r>
     </w:p>
     <w:p>
@@ -3522,7 +3522,7 @@
           <w:color w:val="222222"/>
           <w:sz w:val="19"/>
         </w:rPr>
-        <w:t>py-3.13-m pip install-r requirements.txt</w:t>
+        <w:t>py -3.13 -m pip install -r requirements.txt</w:t>
       </w:r>
     </w:p>
     <w:p>
@@ -3530,7 +3530,7 @@
         <w:pStyle w:val="5"/>
       </w:pPr>
       <w:r>
-        <w:t>10.3提示8501被占用</w:t>
+        <w:t>10.3 提示8501被占用或重复启动</w:t>
       </w:r>
     </w:p>
     <w:p>
@@ -3547,7 +3547,7 @@
         <w:rPr>
           <w:rFonts w:ascii="微软雅黑" w:hAnsi="微软雅黑" w:eastAsia="微软雅黑" w:cs="微软雅黑"/>
         </w:rPr>
-        <w:t>关闭以前打开的Yang-gumi黑色窗口。</w:t>
+        <w:t>新版启动器会先识别8501端口上的进程；只有命令行、app.py和安装目录都属于当前Yang-gumi时，才会结束旧实例并等待端口释放。</w:t>
       </w:r>
     </w:p>
     <w:p>
@@ -3564,7 +3564,7 @@
         <w:rPr>
           <w:rFonts w:ascii="微软雅黑" w:hAnsi="微软雅黑" w:eastAsia="微软雅黑" w:cs="微软雅黑"/>
         </w:rPr>
-        <w:t>等待数秒后重新启动。</w:t>
+        <w:t>正常情况下直接再次双击“启动 Yang-gumi.bat”即可，新启动会替换旧启动，并保持只有一个主站窗口负责8501端口。</w:t>
       </w:r>
     </w:p>
     <w:p>
@@ -3581,7 +3581,7 @@
         <w:rPr>
           <w:rFonts w:ascii="微软雅黑" w:hAnsi="微软雅黑" w:eastAsia="微软雅黑" w:cs="微软雅黑"/>
         </w:rPr>
-        <w:t>仍然占用时重启电脑，再只运行一次启动文件。</w:t>
+        <w:t>如果8501由其他程序占用，Yang-gumi会拒绝误结束该程序并显示提示。请自行关闭真正占用8501的程序后再启动，不需要修改IP、网卡、防火墙或注册表。</w:t>
       </w:r>
     </w:p>
     <w:p>
@@ -3605,7 +3605,7 @@
         <w:pStyle w:val="5"/>
       </w:pPr>
       <w:r>
-        <w:t>10.5 Bangumi搜索、封面或季度内容很慢</w:t>
+        <w:t>10.5 Bangumi、YUC、封面或季度内容很慢</w:t>
       </w:r>
     </w:p>
     <w:p>
@@ -3639,7 +3639,7 @@
         <w:rPr>
           <w:rFonts w:ascii="微软雅黑" w:hAnsi="微软雅黑" w:eastAsia="微软雅黑" w:cs="微软雅黑"/>
         </w:rPr>
-        <w:t>等待当前请求完成，不要连续点击同一个按钮。</w:t>
+        <w:t>等待当前请求完成，不要连续点击同一个按钮。季度刷新需要同时核对Bangumi与YUC，网络波动时会比普通页面更慢。</w:t>
       </w:r>
     </w:p>
     <w:p>
@@ -3656,7 +3656,7 @@
         <w:rPr>
           <w:rFonts w:ascii="微软雅黑" w:hAnsi="微软雅黑" w:eastAsia="微软雅黑" w:cs="微软雅黑"/>
         </w:rPr>
-        <w:t>失败后稍后再试。本地条目和已经保存的评分不会因此丢失。</w:t>
+        <w:t>失败后稍后再点击“刷新本季新番”。异常结果会被拒绝并保留上一次可用缓存，本地条目、状态和评分不会因此丢失。</w:t>
       </w:r>
     </w:p>
     <w:p>
@@ -3774,7 +3774,7 @@
         <w:rPr>
           <w:rFonts w:ascii="微软雅黑" w:hAnsi="微软雅黑" w:eastAsia="微软雅黑" w:cs="微软雅黑"/>
         </w:rPr>
-        <w:t>主人确认分享窗口仍然打开，电脑没有休眠并且网络正常。</w:t>
+        <w:t>主人确认分享窗口仍然打开，电脑没有休眠并且网络正常；先查看数据管理中的分享状态。</w:t>
       </w:r>
     </w:p>
     <w:p>
@@ -3791,7 +3791,7 @@
         <w:rPr>
           <w:rFonts w:ascii="微软雅黑" w:hAnsi="微软雅黑" w:eastAsia="微软雅黑" w:cs="微软雅黑"/>
         </w:rPr>
-        <w:t>主人自己先打开当前分享网址。</w:t>
+        <w:t>主人先打开当前分享网址或运行访客启动文件；如果状态显示正在重连，等待自动恢复完成后再测试。</w:t>
       </w:r>
     </w:p>
     <w:p>
@@ -3808,7 +3808,7 @@
         <w:rPr>
           <w:rFonts w:ascii="微软雅黑" w:hAnsi="微软雅黑" w:eastAsia="微软雅黑" w:cs="微软雅黑"/>
         </w:rPr>
-        <w:t>重新开始分享，并发送最新网址或重新复制“给访客打开Yang-gumi.bat”。</w:t>
+        <w:t>直接HTTPS网址失效时，重新开始分享并发送最新网址；访客启动文件会通过稳定定位器寻找当前入口，通常不必重新下载整个项目。</w:t>
       </w:r>
     </w:p>
     <w:p>
@@ -3825,7 +3825,7 @@
         <w:rPr>
           <w:rFonts w:ascii="微软雅黑" w:hAnsi="微软雅黑" w:eastAsia="微软雅黑" w:cs="微软雅黑"/>
         </w:rPr>
-        <w:t>不要修改IP、网卡、代理、路由器或防火墙来尝试修复。正常分享不要求这些操作。</w:t>
+        <w:t>免费公网通道持续不可用时，页面会保留错误或重试状态，主站和个人数据仍可正常使用。不要为此修改IP、网卡、代理、DNS、路由器或防火墙。</w:t>
       </w:r>
     </w:p>
     <w:p>
@@ -3842,6 +3842,30 @@
           <w:rFonts w:ascii="微软雅黑" w:hAnsi="微软雅黑" w:eastAsia="微软雅黑" w:cs="微软雅黑"/>
         </w:rPr>
         <w:t>先点击“一键备份数据库”，再选择要加载的.db文件。恢复会替换当前评分数据库；XLSX、CSV和JSON文件不能直接代替完整数据库恢复。</w:t>
+      </w:r>
+    </w:p>
+    <w:p>
+      <w:pPr>
+        <w:pStyle w:val="5"/>
+      </w:pPr>
+      <w:r>
+        <w:t>10.9 更新后页面仍是旧版或担心个人内容被覆盖</w:t>
+      </w:r>
+    </w:p>
+    <w:p>
+      <w:r>
+        <w:rPr>
+          <w:rFonts w:ascii="微软雅黑" w:hAnsi="微软雅黑" w:eastAsia="微软雅黑" w:cs="微软雅黑"/>
+        </w:rPr>
+        <w:t>当前更新器会在成功后安全重启本目录正在运行的网站；未运行的网站不会被额外启动。若从很旧的版本升级后浏览器仍显示旧内容，先关闭旧启动窗口，再运行一次“检查并更新 Yang-gumi.bat”，完成后刷新页面。</w:t>
+      </w:r>
+    </w:p>
+    <w:p>
+      <w:r>
+        <w:rPr>
+          <w:rFonts w:ascii="微软雅黑" w:hAnsi="微软雅黑" w:eastAsia="微软雅黑" w:cs="微软雅黑"/>
+        </w:rPr>
+        <w:t>更新控制台应显示“0 个个人内容文件进入更新计划”。只要数据库、评分或收藏、今日美图设置、图片索引、本地海报或背景进入计划，更新会在写入前停止；程序回滚也不会把旧数据库覆盖到后来新增的记录上。</w:t>
       </w:r>
     </w:p>
     <w:p>
@@ -4168,7 +4192,7 @@
                 <w:rFonts w:ascii="微软雅黑" w:hAnsi="微软雅黑" w:eastAsia="微软雅黑" w:cs="微软雅黑"/>
                 <w:sz w:val="19"/>
               </w:rPr>
-              <w:t>评分设置和界面设置</w:t>
+              <w:t>评分设置、界面设置和本机路径</w:t>
             </w:r>
           </w:p>
         </w:tc>
@@ -4193,7 +4217,7 @@
                 <w:rFonts w:ascii="微软雅黑" w:hAnsi="微软雅黑" w:eastAsia="微软雅黑" w:cs="微软雅黑"/>
                 <w:sz w:val="19"/>
               </w:rPr>
-              <w:t>保存在data文件夹中的配置文件。</w:t>
+              <w:t>保存在data文件夹中的配置文件；今日美图目录、图片索引等只属于本机，不应发布。</w:t>
             </w:r>
           </w:p>
         </w:tc>
@@ -5120,7 +5144,7 @@
                 <w:rFonts w:ascii="微软雅黑" w:hAnsi="微软雅黑" w:eastAsia="微软雅黑" w:cs="微软雅黑"/>
                 <w:sz w:val="19"/>
               </w:rPr>
-              <w:t>查看个人统计、今日美图、本季新番、观看状态、最近添加和最近完成。</w:t>
+              <w:t>查看个人统计、今日美图、日本非短篇TV本季新番海报墙、全发行形式新番时光机、最近添加和最近完成。</w:t>
             </w:r>
           </w:p>
         </w:tc>
@@ -5324,7 +5348,7 @@
                 <w:rFonts w:ascii="微软雅黑" w:hAnsi="微软雅黑" w:eastAsia="微软雅黑" w:cs="微软雅黑"/>
                 <w:sz w:val="19"/>
               </w:rPr>
-              <w:t>浏览和关联公开条目，更新公开评分、排名、封面、简介和标签。</w:t>
+              <w:t>浏览和关联公开条目，更新公开评分、排名、封面、简介和标签；搜索分类可固定为默认值。</w:t>
             </w:r>
           </w:p>
         </w:tc>
@@ -5460,7 +5484,7 @@
                 <w:rFonts w:ascii="微软雅黑" w:hAnsi="微软雅黑" w:eastAsia="微软雅黑" w:cs="微软雅黑"/>
                 <w:sz w:val="19"/>
               </w:rPr>
-              <w:t>比较个人评分与Bangumi公共评分，并统一比较、调整每个评分小项目。</w:t>
+              <w:t>比较个人评分与Bangumi公共评分，用全部/偏高/偏低/接近按钮筛选，并统一比较、调整每个评分小项目。</w:t>
             </w:r>
           </w:p>
         </w:tc>
@@ -5707,7 +5731,39 @@
         <w:rPr>
           <w:rFonts w:ascii="微软雅黑" w:hAnsi="微软雅黑" w:eastAsia="微软雅黑" w:cs="微软雅黑"/>
         </w:rPr>
-        <w:t>本季新番区域显示当前季度作品、放送信息、Bangumi公共评分、人数和本地状态。可以按星期跳转、搜索标题、改变排序，并在卡片上直接标记状态。</w:t>
+        <w:t>本季新番海报墙显示当前季度的日本非短篇TV动画、放送信息、Bangumi公共评分、人数和本地状态。可以按星期跳转、搜索标题、改变排序，并在卡片上直接标记状态。</w:t>
+      </w:r>
+    </w:p>
+    <w:p>
+      <w:r>
+        <w:rPr>
+          <w:rFonts w:ascii="微软雅黑" w:hAnsi="微软雅黑" w:eastAsia="微软雅黑" w:cs="微软雅黑"/>
+        </w:rPr>
+        <w:t>程序每天按本地时间 00:00 交叉核对 https://bgm.tv/calendar 与 YUC 当季表（https://yuc.wiki/YYYYMM/）。YUC 周播表用于限定候选，Bangumi 用于逐部核验并补全标题、海报、评分和放送信息；剧场版、OVA、WEB、SP 和短篇动画不会进入主海报墙。</w:t>
+      </w:r>
+    </w:p>
+    <w:p>
+      <w:r>
+        <w:rPr>
+          <w:rFonts w:ascii="微软雅黑" w:hAnsi="微软雅黑" w:eastAsia="微软雅黑" w:cs="微软雅黑"/>
+        </w:rPr>
+        <w:t>刷新结果会与 YUC 当季主清单核对数量；差异超过 5 部时会拒绝异常刷新并保留旧缓存。2026 年 7 月例子中，海报墙 70 部、YUC 主清单 66 部，差异为 4 部，处于允许范围。</w:t>
+      </w:r>
+    </w:p>
+    <w:p>
+      <w:r>
+        <w:rPr>
+          <w:rFonts w:ascii="微软雅黑" w:hAnsi="微软雅黑" w:eastAsia="微软雅黑" w:cs="微软雅黑"/>
+        </w:rPr>
+        <w:t>季番缓存记录算法版本；即使旧算法当天已经刷新，升级后也会自动重建公开缓存。刷新只更新公开季度资料，保留作品状态、日期、评分、笔记和其他个人字段。</w:t>
+      </w:r>
+    </w:p>
+    <w:p>
+      <w:r>
+        <w:rPr>
+          <w:rFonts w:ascii="微软雅黑" w:hAnsi="微软雅黑" w:eastAsia="微软雅黑" w:cs="微软雅黑"/>
+        </w:rPr>
+        <w:t>首页下方的“新番时光机”不受主海报墙限制，继续展示TV、剧场版、OVA、WEB、SP等全部动画发行形式。</w:t>
       </w:r>
     </w:p>
     <w:p>
@@ -6504,6 +6560,14 @@
         <w:rPr>
           <w:rFonts w:ascii="微软雅黑" w:hAnsi="微软雅黑" w:eastAsia="微软雅黑" w:cs="微软雅黑"/>
         </w:rPr>
+        <w:t>搜索分类旁的“固定”按钮可以把当前分类保存为默认值；新增条目、Bangumi排行和公开搜索共用该选择，刷新页面或重新启动后仍会保留。</w:t>
+      </w:r>
+    </w:p>
+    <w:p>
+      <w:r>
+        <w:rPr>
+          <w:rFonts w:ascii="微软雅黑" w:hAnsi="微软雅黑" w:eastAsia="微软雅黑" w:cs="微软雅黑"/>
+        </w:rPr>
         <w:t>同名作品可能有不同季度、续作、剧场版或不同载体。选择前要核对封面、年份、类型和副标题，避免关联到错误条目。</w:t>
       </w:r>
     </w:p>
@@ -7288,7 +7352,15 @@
         <w:rPr>
           <w:rFonts w:ascii="微软雅黑" w:hAnsi="微软雅黑" w:eastAsia="微软雅黑" w:cs="微软雅黑"/>
         </w:rPr>
-        <w:t>评分对比先显示个人平均分、Bangumi平均分、平均差值、个人高于或低于公共评分的数量，并提供“我比Bangumi高最多”“我比Bangumi低最多”“最一致”等榜单。</w:t>
+        <w:t>评分对比顶部以紧凑总览显示已对比数量、我的均分、Bangumi均分、平均差值和平均评分人数；类型、状态和标签放在“筛选对比范围”中按需展开。</w:t>
+      </w:r>
+    </w:p>
+    <w:p>
+      <w:r>
+        <w:rPr>
+          <w:rFonts w:ascii="微软雅黑" w:hAnsi="微软雅黑" w:eastAsia="微软雅黑" w:cs="微软雅黑"/>
+        </w:rPr>
+        <w:t>“全部”“偏高”“偏低”“接近”是互斥按钮，并显示各组数量。偏高表示差值大于 0.5，偏低表示差值小于 -0.5，接近表示差值位于 -0.5 至 0.5 且包含边界；缺少完整个人分或 Bangumi 分的作品不会进入这三个差值组。</w:t>
       </w:r>
     </w:p>
     <w:p>
@@ -7312,7 +7384,21 @@
         <w:rPr>
           <w:rFonts w:ascii="微软雅黑" w:hAnsi="微软雅黑" w:eastAsia="微软雅黑" w:cs="微软雅黑"/>
         </w:rPr>
-        <w:t>分项评分校准台用于把所有作品的同一个小项目放到同一画面中比较。例如选择“剧情”，就可以按剧情从高到低或从低到高排列，直观看出不同作品之间的差距，减少不同时间评分时出现标准不一致。</w:t>
+        <w:t>分项评分校准台用于把所有作品的同一个小项目放到同一画面中比较。例如选择“剧情”，就可以按剧情从高到低或从低到高排列，直观看出不同作品之间的差距，减少不同时间评分时出现标准不一致。上方评分差按钮会同时筛选这一列表。</w:t>
+      </w:r>
+    </w:p>
+    <w:p>
+      <w:pPr>
+        <w:numPr>
+          <w:ilvl w:val="0"/>
+          <w:numId w:val="7"/>
+        </w:numPr>
+      </w:pPr>
+      <w:r>
+        <w:rPr>
+          <w:rFonts w:ascii="微软雅黑" w:hAnsi="微软雅黑" w:eastAsia="微软雅黑" w:cs="微软雅黑"/>
+        </w:rPr>
+        <w:t>评分差筛选：选择“全部”“偏高”“偏低”或“接近”后，分项列表立即更新并自动回到第1页。</w:t>
       </w:r>
     </w:p>
     <w:p>
@@ -8206,7 +8292,7 @@
         <w:rPr>
           <w:rFonts w:ascii="微软雅黑" w:hAnsi="微软雅黑" w:eastAsia="微软雅黑" w:cs="微软雅黑"/>
         </w:rPr>
-        <w:t>双击“启动Yang-gumi.bat”，打开主站。</w:t>
+        <w:t>双击“启动 Yang-gumi.bat”，打开主站。</w:t>
       </w:r>
     </w:p>
     <w:p>
@@ -8223,7 +8309,7 @@
         <w:rPr>
           <w:rFonts w:ascii="微软雅黑" w:hAnsi="微软雅黑" w:eastAsia="微软雅黑" w:cs="微软雅黑"/>
         </w:rPr>
-        <w:t>在首页查看本季新番和近期记录。</w:t>
+        <w:t>在首页查看只含日本非短篇TV的本季新番海报墙，并用下方新番时光机回看全部发行形式。</w:t>
       </w:r>
     </w:p>
     <w:p>
@@ -8274,7 +8360,7 @@
         <w:rPr>
           <w:rFonts w:ascii="微软雅黑" w:hAnsi="微软雅黑" w:eastAsia="微软雅黑" w:cs="微软雅黑"/>
         </w:rPr>
-        <w:t>定期打开评分对比，用同一评分小项目统一查看高低顺序。</w:t>
+        <w:t>定期打开评分对比，先用“偏高”“偏低”“接近”按钮观察口味差异，再用同一评分小项目统一查看高低顺序。</w:t>
       </w:r>
     </w:p>
     <w:p>

</xml_diff>